<commit_message>
[BBB_KGDB][USB] - update 10_USB/Sketch
</commit_message>
<xml_diff>
--- a/03_Learning/04_LINUX_Common/04_Modules/BBB_KGDB/10_USB/01_INFO/USB_protocol/USB_Descriptors.docx
+++ b/03_Learning/04_LINUX_Common/04_Modules/BBB_KGDB/10_USB/01_INFO/USB_protocol/USB_Descriptors.docx
@@ -1,11 +1,14 @@
 
 <file path=word/document.xml><?xml version="1.0" encoding="utf-8"?>
-<w:document xmlns:wpc="http://schemas.microsoft.com/office/word/2010/wordprocessingCanvas" xmlns:cx="http://schemas.microsoft.com/office/drawing/2014/chartex" xmlns:cx1="http://schemas.microsoft.com/office/drawing/2015/9/8/chartex" xmlns:mc="http://schemas.openxmlformats.org/markup-compatibility/2006" xmlns:o="urn:schemas-microsoft-com:office:office" xmlns:r="http://schemas.openxmlformats.org/officeDocument/2006/relationships" xmlns:m="http://schemas.openxmlformats.org/officeDocument/2006/math" xmlns:v="urn:schemas-microsoft-com:vml" xmlns:wp14="http://schemas.microsoft.com/office/word/2010/wordprocessingDrawing" xmlns:wp="http://schemas.openxmlformats.org/drawingml/2006/wordprocessingDrawing" xmlns:w10="urn:schemas-microsoft-com:office:word" xmlns:w="http://schemas.openxmlformats.org/wordprocessingml/2006/main" xmlns:w14="http://schemas.microsoft.com/office/word/2010/wordml" xmlns:w15="http://schemas.microsoft.com/office/word/2012/wordml" xmlns:w16se="http://schemas.microsoft.com/office/word/2015/wordml/symex" xmlns:wpg="http://schemas.microsoft.com/office/word/2010/wordprocessingGroup" xmlns:wpi="http://schemas.microsoft.com/office/word/2010/wordprocessingInk" xmlns:wne="http://schemas.microsoft.com/office/word/2006/wordml" xmlns:wps="http://schemas.microsoft.com/office/word/2010/wordprocessingShape" mc:Ignorable="w14 w15 w16se wp14">
+<w:document xmlns:wpc="http://schemas.microsoft.com/office/word/2010/wordprocessingCanvas" xmlns:cx="http://schemas.microsoft.com/office/drawing/2014/chartex" xmlns:cx1="http://schemas.microsoft.com/office/drawing/2015/9/8/chartex" xmlns:cx2="http://schemas.microsoft.com/office/drawing/2015/10/21/chartex" xmlns:cx3="http://schemas.microsoft.com/office/drawing/2016/5/9/chartex" xmlns:cx4="http://schemas.microsoft.com/office/drawing/2016/5/10/chartex" xmlns:cx5="http://schemas.microsoft.com/office/drawing/2016/5/11/chartex" xmlns:cx6="http://schemas.microsoft.com/office/drawing/2016/5/12/chartex" xmlns:cx7="http://schemas.microsoft.com/office/drawing/2016/5/13/chartex" xmlns:cx8="http://schemas.microsoft.com/office/drawing/2016/5/14/chartex" xmlns:mc="http://schemas.openxmlformats.org/markup-compatibility/2006" xmlns:aink="http://schemas.microsoft.com/office/drawing/2016/ink" xmlns:am3d="http://schemas.microsoft.com/office/drawing/2017/model3d" xmlns:o="urn:schemas-microsoft-com:office:office" xmlns:oel="http://schemas.microsoft.com/office/2019/extlst" xmlns:r="http://schemas.openxmlformats.org/officeDocument/2006/relationships" xmlns:m="http://schemas.openxmlformats.org/officeDocument/2006/math" xmlns:v="urn:schemas-microsoft-com:vml" xmlns:wp14="http://schemas.microsoft.com/office/word/2010/wordprocessingDrawing" xmlns:wp="http://schemas.openxmlformats.org/drawingml/2006/wordprocessingDrawing" xmlns:w10="urn:schemas-microsoft-com:office:word" xmlns:w="http://schemas.openxmlformats.org/wordprocessingml/2006/main" xmlns:w14="http://schemas.microsoft.com/office/word/2010/wordml" xmlns:w15="http://schemas.microsoft.com/office/word/2012/wordml" xmlns:w16cex="http://schemas.microsoft.com/office/word/2018/wordml/cex" xmlns:w16cid="http://schemas.microsoft.com/office/word/2016/wordml/cid" xmlns:w16="http://schemas.microsoft.com/office/word/2018/wordml" xmlns:w16du="http://schemas.microsoft.com/office/word/2023/wordml/word16du" xmlns:w16sdtdh="http://schemas.microsoft.com/office/word/2020/wordml/sdtdatahash" xmlns:w16sdtfl="http://schemas.microsoft.com/office/word/2024/wordml/sdtformatlock" xmlns:w16se="http://schemas.microsoft.com/office/word/2015/wordml/symex" xmlns:wpg="http://schemas.microsoft.com/office/word/2010/wordprocessingGroup" xmlns:wpi="http://schemas.microsoft.com/office/word/2010/wordprocessingInk" xmlns:wne="http://schemas.microsoft.com/office/word/2006/wordml" xmlns:wps="http://schemas.microsoft.com/office/word/2010/wordprocessingShape" mc:Ignorable="w14 w15 w16se w16cid w16 w16cex w16sdtdh w16sdtfl w16du wp14">
   <w:body>
     <w:p>
       <w:r>
+        <w:rPr>
+          <w:noProof/>
+        </w:rPr>
         <w:drawing>
-          <wp:inline distT="0" distB="0" distL="0" distR="0" wp14:anchorId="5DEA9C2C" wp14:editId="4EC955B7">
+          <wp:inline distT="0" distB="0" distL="0" distR="0" wp14:anchorId="69562984" wp14:editId="29839268">
             <wp:extent cx="2238687" cy="1019317"/>
             <wp:effectExtent l="0" t="0" r="9525" b="9525"/>
             <wp:docPr id="1" name="Picture 1"/>
@@ -48,8 +51,11 @@
         </w:pBdr>
       </w:pPr>
       <w:r>
+        <w:rPr>
+          <w:noProof/>
+        </w:rPr>
         <w:drawing>
-          <wp:inline distT="0" distB="0" distL="0" distR="0" wp14:anchorId="3E6FAF43" wp14:editId="6D35AC19">
+          <wp:inline distT="0" distB="0" distL="0" distR="0" wp14:anchorId="37947760" wp14:editId="55B45E50">
             <wp:extent cx="5858693" cy="2562583"/>
             <wp:effectExtent l="0" t="0" r="8890" b="9525"/>
             <wp:docPr id="2" name="Picture 2"/>
@@ -86,34 +92,24 @@
       </w:r>
     </w:p>
     <w:p>
-      <w:r>
-        <w:rPr>
-          <w:b/>
-          <w:sz w:val="40"/>
-          <w:szCs w:val="40"/>
-        </w:rPr>
-        <w:t>device descriptor</w:t>
-      </w:r>
-      <w:r>
-        <w:rPr>
-          <w:b/>
-          <w:sz w:val="40"/>
-          <w:szCs w:val="40"/>
-        </w:rPr>
-        <w:t xml:space="preserve"> (host reads)</w:t>
-      </w:r>
-      <w:r>
-        <w:t>:</w:t>
-      </w:r>
+      <w:pPr>
+        <w:pBdr>
+          <w:bottom w:val="double" w:sz="6" w:space="1" w:color="auto"/>
+        </w:pBdr>
+      </w:pPr>
     </w:p>
     <w:p>
-      <w:r>
-        <w:lastRenderedPageBreak/>
+      <w:pPr>
+        <w:pBdr>
+          <w:bottom w:val="double" w:sz="6" w:space="1" w:color="auto"/>
+        </w:pBdr>
+      </w:pPr>
+      <w:r>
         <w:drawing>
-          <wp:inline distT="0" distB="0" distL="0" distR="0" wp14:anchorId="19B5500A" wp14:editId="491CF97A">
-            <wp:extent cx="5792008" cy="4801270"/>
+          <wp:inline distT="0" distB="0" distL="0" distR="0" wp14:anchorId="18CEACDB" wp14:editId="210AD422">
+            <wp:extent cx="5943600" cy="3628390"/>
             <wp:effectExtent l="0" t="0" r="0" b="0"/>
-            <wp:docPr id="3" name="Picture 3"/>
+            <wp:docPr id="2071283598" name="Picture 1"/>
             <wp:cNvGraphicFramePr>
               <a:graphicFrameLocks xmlns:a="http://schemas.openxmlformats.org/drawingml/2006/main" noChangeAspect="1"/>
             </wp:cNvGraphicFramePr>
@@ -121,7 +117,7 @@
               <a:graphicData uri="http://schemas.openxmlformats.org/drawingml/2006/picture">
                 <pic:pic xmlns:pic="http://schemas.openxmlformats.org/drawingml/2006/picture">
                   <pic:nvPicPr>
-                    <pic:cNvPr id="1" name=""/>
+                    <pic:cNvPr id="2071283598" name=""/>
                     <pic:cNvPicPr/>
                   </pic:nvPicPr>
                   <pic:blipFill>
@@ -133,7 +129,7 @@
                   <pic:spPr>
                     <a:xfrm>
                       <a:off x="0" y="0"/>
-                      <a:ext cx="5792008" cy="4801270"/>
+                      <a:ext cx="5943600" cy="3628390"/>
                     </a:xfrm>
                     <a:prstGeom prst="rect">
                       <a:avLst/>
@@ -146,7 +142,6 @@
         </w:drawing>
       </w:r>
     </w:p>
-    <w:p/>
     <w:p>
       <w:r>
         <w:rPr>
@@ -154,7 +149,8 @@
           <w:sz w:val="40"/>
           <w:szCs w:val="40"/>
         </w:rPr>
-        <w:t>configuration</w:t>
+        <w:lastRenderedPageBreak/>
+        <w:t>device descriptor</w:t>
       </w:r>
       <w:r>
         <w:rPr>
@@ -162,31 +158,7 @@
           <w:sz w:val="40"/>
           <w:szCs w:val="40"/>
         </w:rPr>
-        <w:t xml:space="preserve"> descriptor</w:t>
-      </w:r>
-      <w:r>
-        <w:rPr>
-          <w:b/>
-          <w:sz w:val="40"/>
-          <w:szCs w:val="40"/>
-        </w:rPr>
-        <w:t xml:space="preserve"> (host </w:t>
-      </w:r>
-      <w:r>
-        <w:rPr>
-          <w:b/>
-          <w:sz w:val="40"/>
-          <w:szCs w:val="40"/>
-        </w:rPr>
-        <w:t>sends</w:t>
-      </w:r>
-      <w:r>
-        <w:rPr>
-          <w:b/>
-          <w:sz w:val="40"/>
-          <w:szCs w:val="40"/>
-        </w:rPr>
-        <w:t>)</w:t>
+        <w:t xml:space="preserve"> (host reads)</w:t>
       </w:r>
       <w:r>
         <w:t>:</w:t>
@@ -194,12 +166,14 @@
     </w:p>
     <w:p>
       <w:r>
-        <w:lastRenderedPageBreak/>
+        <w:rPr>
+          <w:noProof/>
+        </w:rPr>
         <w:drawing>
-          <wp:inline distT="0" distB="0" distL="0" distR="0" wp14:anchorId="2E4ED19D" wp14:editId="57771BC2">
-            <wp:extent cx="5715798" cy="2686425"/>
+          <wp:inline distT="0" distB="0" distL="0" distR="0" wp14:anchorId="039304FF" wp14:editId="3A336DA0">
+            <wp:extent cx="5792008" cy="4801270"/>
             <wp:effectExtent l="0" t="0" r="0" b="0"/>
-            <wp:docPr id="4" name="Picture 4"/>
+            <wp:docPr id="3" name="Picture 3"/>
             <wp:cNvGraphicFramePr>
               <a:graphicFrameLocks xmlns:a="http://schemas.openxmlformats.org/drawingml/2006/main" noChangeAspect="1"/>
             </wp:cNvGraphicFramePr>
@@ -219,7 +193,7 @@
                   <pic:spPr>
                     <a:xfrm>
                       <a:off x="0" y="0"/>
-                      <a:ext cx="5715798" cy="2686425"/>
+                      <a:ext cx="5792008" cy="4801270"/>
                     </a:xfrm>
                     <a:prstGeom prst="rect">
                       <a:avLst/>
@@ -240,7 +214,7 @@
           <w:sz w:val="40"/>
           <w:szCs w:val="40"/>
         </w:rPr>
-        <w:t>interface</w:t>
+        <w:t>configuration</w:t>
       </w:r>
       <w:r>
         <w:rPr>
@@ -256,23 +230,7 @@
           <w:sz w:val="40"/>
           <w:szCs w:val="40"/>
         </w:rPr>
-        <w:t xml:space="preserve"> (host </w:t>
-      </w:r>
-      <w:r>
-        <w:rPr>
-          <w:b/>
-          <w:sz w:val="40"/>
-          <w:szCs w:val="40"/>
-        </w:rPr>
-        <w:t>reads</w:t>
-      </w:r>
-      <w:r>
-        <w:rPr>
-          <w:b/>
-          <w:sz w:val="40"/>
-          <w:szCs w:val="40"/>
-        </w:rPr>
-        <w:t>)</w:t>
+        <w:t xml:space="preserve"> (host sends)</w:t>
       </w:r>
       <w:r>
         <w:t>:</w:t>
@@ -280,11 +238,15 @@
     </w:p>
     <w:p>
       <w:r>
+        <w:rPr>
+          <w:noProof/>
+        </w:rPr>
+        <w:lastRenderedPageBreak/>
         <w:drawing>
-          <wp:inline distT="0" distB="0" distL="0" distR="0" wp14:anchorId="72249C5A" wp14:editId="0D3AEC54">
-            <wp:extent cx="5782482" cy="2343477"/>
-            <wp:effectExtent l="0" t="0" r="8890" b="0"/>
-            <wp:docPr id="5" name="Picture 5"/>
+          <wp:inline distT="0" distB="0" distL="0" distR="0" wp14:anchorId="6201556F" wp14:editId="68377A02">
+            <wp:extent cx="5715798" cy="2686425"/>
+            <wp:effectExtent l="0" t="0" r="0" b="0"/>
+            <wp:docPr id="4" name="Picture 4"/>
             <wp:cNvGraphicFramePr>
               <a:graphicFrameLocks xmlns:a="http://schemas.openxmlformats.org/drawingml/2006/main" noChangeAspect="1"/>
             </wp:cNvGraphicFramePr>
@@ -304,7 +266,7 @@
                   <pic:spPr>
                     <a:xfrm>
                       <a:off x="0" y="0"/>
-                      <a:ext cx="5782482" cy="2343477"/>
+                      <a:ext cx="5715798" cy="2686425"/>
                     </a:xfrm>
                     <a:prstGeom prst="rect">
                       <a:avLst/>
@@ -319,20 +281,21 @@
     </w:p>
     <w:p/>
     <w:p>
-      <w:pPr>
+      <w:r>
         <w:rPr>
           <w:b/>
           <w:sz w:val="40"/>
           <w:szCs w:val="40"/>
         </w:rPr>
-      </w:pPr>
+        <w:t>interface</w:t>
+      </w:r>
       <w:r>
         <w:rPr>
           <w:b/>
           <w:sz w:val="40"/>
           <w:szCs w:val="40"/>
         </w:rPr>
-        <w:t>endpoint</w:t>
+        <w:t xml:space="preserve"> descriptor</w:t>
       </w:r>
       <w:r>
         <w:rPr>
@@ -340,25 +303,22 @@
           <w:sz w:val="40"/>
           <w:szCs w:val="40"/>
         </w:rPr>
-        <w:t xml:space="preserve"> descriptor</w:t>
-      </w:r>
-      <w:r>
-        <w:rPr>
-          <w:b/>
-          <w:sz w:val="40"/>
-          <w:szCs w:val="40"/>
-        </w:rPr>
+        <w:t xml:space="preserve"> (host reads)</w:t>
+      </w:r>
+      <w:r>
         <w:t>:</w:t>
       </w:r>
     </w:p>
     <w:p>
       <w:r>
-        <w:lastRenderedPageBreak/>
+        <w:rPr>
+          <w:noProof/>
+        </w:rPr>
         <w:drawing>
-          <wp:inline distT="0" distB="0" distL="0" distR="0" wp14:anchorId="100CDD80" wp14:editId="0B1E21C1">
-            <wp:extent cx="5687219" cy="4982270"/>
-            <wp:effectExtent l="0" t="0" r="8890" b="8890"/>
-            <wp:docPr id="6" name="Picture 6"/>
+          <wp:inline distT="0" distB="0" distL="0" distR="0" wp14:anchorId="33509424" wp14:editId="354FF4C2">
+            <wp:extent cx="5782482" cy="2343477"/>
+            <wp:effectExtent l="0" t="0" r="8890" b="0"/>
+            <wp:docPr id="5" name="Picture 5"/>
             <wp:cNvGraphicFramePr>
               <a:graphicFrameLocks xmlns:a="http://schemas.openxmlformats.org/drawingml/2006/main" noChangeAspect="1"/>
             </wp:cNvGraphicFramePr>
@@ -378,6 +338,83 @@
                   <pic:spPr>
                     <a:xfrm>
                       <a:off x="0" y="0"/>
+                      <a:ext cx="5782482" cy="2343477"/>
+                    </a:xfrm>
+                    <a:prstGeom prst="rect">
+                      <a:avLst/>
+                    </a:prstGeom>
+                  </pic:spPr>
+                </pic:pic>
+              </a:graphicData>
+            </a:graphic>
+          </wp:inline>
+        </w:drawing>
+      </w:r>
+    </w:p>
+    <w:p/>
+    <w:p>
+      <w:pPr>
+        <w:rPr>
+          <w:b/>
+          <w:sz w:val="40"/>
+          <w:szCs w:val="40"/>
+        </w:rPr>
+      </w:pPr>
+      <w:r>
+        <w:rPr>
+          <w:b/>
+          <w:sz w:val="40"/>
+          <w:szCs w:val="40"/>
+        </w:rPr>
+        <w:t>endpoint</w:t>
+      </w:r>
+      <w:r>
+        <w:rPr>
+          <w:b/>
+          <w:sz w:val="40"/>
+          <w:szCs w:val="40"/>
+        </w:rPr>
+        <w:t xml:space="preserve"> descriptor</w:t>
+      </w:r>
+      <w:r>
+        <w:rPr>
+          <w:b/>
+          <w:sz w:val="40"/>
+          <w:szCs w:val="40"/>
+        </w:rPr>
+        <w:t>:</w:t>
+      </w:r>
+    </w:p>
+    <w:p>
+      <w:r>
+        <w:rPr>
+          <w:noProof/>
+        </w:rPr>
+        <w:lastRenderedPageBreak/>
+        <w:drawing>
+          <wp:inline distT="0" distB="0" distL="0" distR="0" wp14:anchorId="576D7B7C" wp14:editId="1E27290D">
+            <wp:extent cx="5687219" cy="4982270"/>
+            <wp:effectExtent l="0" t="0" r="8890" b="8890"/>
+            <wp:docPr id="6" name="Picture 6"/>
+            <wp:cNvGraphicFramePr>
+              <a:graphicFrameLocks xmlns:a="http://schemas.openxmlformats.org/drawingml/2006/main" noChangeAspect="1"/>
+            </wp:cNvGraphicFramePr>
+            <a:graphic xmlns:a="http://schemas.openxmlformats.org/drawingml/2006/main">
+              <a:graphicData uri="http://schemas.openxmlformats.org/drawingml/2006/picture">
+                <pic:pic xmlns:pic="http://schemas.openxmlformats.org/drawingml/2006/picture">
+                  <pic:nvPicPr>
+                    <pic:cNvPr id="1" name=""/>
+                    <pic:cNvPicPr/>
+                  </pic:nvPicPr>
+                  <pic:blipFill>
+                    <a:blip r:embed="rId10"/>
+                    <a:stretch>
+                      <a:fillRect/>
+                    </a:stretch>
+                  </pic:blipFill>
+                  <pic:spPr>
+                    <a:xfrm>
+                      <a:off x="0" y="0"/>
                       <a:ext cx="5687219" cy="4982270"/>
                     </a:xfrm>
                     <a:prstGeom prst="rect">
@@ -392,10 +429,7 @@
       </w:r>
     </w:p>
     <w:p/>
-    <w:p>
-      <w:bookmarkStart w:id="0" w:name="_GoBack"/>
-      <w:bookmarkEnd w:id="0"/>
-    </w:p>
+    <w:p/>
     <w:sectPr>
       <w:pgSz w:w="12240" w:h="15840"/>
       <w:pgMar w:top="1440" w:right="1440" w:bottom="1440" w:left="1440" w:header="720" w:footer="720" w:gutter="0"/>
@@ -407,7 +441,7 @@
 </file>
 
 <file path=word/styles.xml><?xml version="1.0" encoding="utf-8"?>
-<w:styles xmlns:mc="http://schemas.openxmlformats.org/markup-compatibility/2006" xmlns:r="http://schemas.openxmlformats.org/officeDocument/2006/relationships" xmlns:w="http://schemas.openxmlformats.org/wordprocessingml/2006/main" xmlns:w14="http://schemas.microsoft.com/office/word/2010/wordml" xmlns:w15="http://schemas.microsoft.com/office/word/2012/wordml" xmlns:w16se="http://schemas.microsoft.com/office/word/2015/wordml/symex" mc:Ignorable="w14 w15 w16se">
+<w:styles xmlns:mc="http://schemas.openxmlformats.org/markup-compatibility/2006" xmlns:r="http://schemas.openxmlformats.org/officeDocument/2006/relationships" xmlns:w="http://schemas.openxmlformats.org/wordprocessingml/2006/main" xmlns:w14="http://schemas.microsoft.com/office/word/2010/wordml" xmlns:w15="http://schemas.microsoft.com/office/word/2012/wordml" xmlns:w16cex="http://schemas.microsoft.com/office/word/2018/wordml/cex" xmlns:w16cid="http://schemas.microsoft.com/office/word/2016/wordml/cid" xmlns:w16="http://schemas.microsoft.com/office/word/2018/wordml" xmlns:w16du="http://schemas.microsoft.com/office/word/2023/wordml/word16du" xmlns:w16sdtdh="http://schemas.microsoft.com/office/word/2020/wordml/sdtdatahash" xmlns:w16sdtfl="http://schemas.microsoft.com/office/word/2024/wordml/sdtformatlock" xmlns:w16se="http://schemas.microsoft.com/office/word/2015/wordml/symex" mc:Ignorable="w14 w15 w16se w16cid w16 w16cex w16sdtdh w16sdtfl w16du">
   <w:docDefaults>
     <w:rPrDefault>
       <w:rPr>
@@ -425,7 +459,7 @@
       </w:pPr>
     </w:pPrDefault>
   </w:docDefaults>
-  <w:latentStyles w:defLockedState="0" w:defUIPriority="99" w:defSemiHidden="0" w:defUnhideWhenUsed="0" w:defQFormat="0" w:count="371">
+  <w:latentStyles w:defLockedState="0" w:defUIPriority="99" w:defSemiHidden="0" w:defUnhideWhenUsed="0" w:defQFormat="0" w:count="376">
     <w:lsdException w:name="Normal" w:uiPriority="0" w:qFormat="1"/>
     <w:lsdException w:name="heading 1" w:uiPriority="9" w:qFormat="1"/>
     <w:lsdException w:name="heading 2" w:semiHidden="1" w:uiPriority="9" w:unhideWhenUsed="1" w:qFormat="1"/>
@@ -797,6 +831,11 @@
     <w:lsdException w:name="List Table 5 Dark Accent 6" w:uiPriority="50"/>
     <w:lsdException w:name="List Table 6 Colorful Accent 6" w:uiPriority="51"/>
     <w:lsdException w:name="List Table 7 Colorful Accent 6" w:uiPriority="52"/>
+    <w:lsdException w:name="Mention" w:semiHidden="1" w:unhideWhenUsed="1"/>
+    <w:lsdException w:name="Smart Hyperlink" w:semiHidden="1" w:unhideWhenUsed="1"/>
+    <w:lsdException w:name="Hashtag" w:semiHidden="1" w:unhideWhenUsed="1"/>
+    <w:lsdException w:name="Unresolved Mention" w:semiHidden="1" w:unhideWhenUsed="1"/>
+    <w:lsdException w:name="Smart Link" w:semiHidden="1" w:unhideWhenUsed="1"/>
   </w:latentStyles>
   <w:style w:type="paragraph" w:default="1" w:styleId="Normal">
     <w:name w:val="Normal"/>

</xml_diff>